<commit_message>
Update walkthrough.md with settings modal tabs section
</commit_message>
<xml_diff>
--- a/tests/output/sample_declaration.docx
+++ b/tests/output/sample_declaration.docx
@@ -4,180 +4,626 @@
   <w:body>
     <w:p>
       <w:pPr>
-        <w:jc w:val="center"/>
+        <w:spacing w:after="200" w:line="300" w:lineRule="auto" w:before="720"/>
+        <w:jc w:val="left"/>
       </w:pPr>
       <w:r>
         <w:rPr>
+          <w:rFonts w:ascii="Quattrocento Sans" w:hAnsi="Quattrocento Sans" w:cs="Quattrocento Sans" w:eastAsia="Quattrocento Sans"/>
           <w:b/>
-          <w:sz w:val="28"/>
+          <w:sz w:val="20"/>
         </w:rPr>
         <w:t>Student Undertaking for Ethical Academic Practice</w:t>
+      </w:r>
+      <w:r>
+        <w:rPr>
+          <w:rFonts w:ascii="Quattrocento Sans" w:hAnsi="Quattrocento Sans" w:cs="Quattrocento Sans" w:eastAsia="Quattrocento Sans"/>
+          <w:b/>
+          <w:sz w:val="20"/>
+        </w:rPr>
+        <w:t>Vidyalankar Institute of Technology, Mumbai</w:t>
       </w:r>
     </w:p>
     <w:p>
       <w:pPr>
-        <w:jc w:val="center"/>
+        <w:spacing w:after="200" w:line="300" w:lineRule="auto"/>
+      </w:pPr>
+    </w:p>
+    <w:tbl>
+      <w:tblPr>
+        <w:tblW w:type="auto" w:w="0"/>
+        <w:tblLook w:firstColumn="1" w:firstRow="1" w:lastColumn="0" w:lastRow="0" w:noHBand="0" w:noVBand="1" w:val="04A0"/>
+        <w:tblBorders>
+          <w:top w:val="none" w:sz="0" w:space="0" w:color="auto"/>
+          <w:left w:val="none" w:sz="0" w:space="0" w:color="auto"/>
+          <w:bottom w:val="none" w:sz="0" w:space="0" w:color="auto"/>
+          <w:right w:val="none" w:sz="0" w:space="0" w:color="auto"/>
+          <w:insideH w:val="none" w:sz="0" w:space="0" w:color="auto"/>
+          <w:insideV w:val="none" w:sz="0" w:space="0" w:color="auto"/>
+        </w:tblBorders>
+        <w:tblCellMar>
+          <w:top w:w="0" w:type="dxa"/>
+          <w:left w:w="0" w:type="dxa"/>
+          <w:bottom w:w="0" w:type="dxa"/>
+          <w:right w:w="0" w:type="dxa"/>
+        </w:tblCellMar>
+        <w:tblInd w:w="0" w:type="dxa"/>
+      </w:tblPr>
+      <w:tblGrid>
+        <w:gridCol w:w="4513"/>
+        <w:gridCol w:w="4513"/>
+      </w:tblGrid>
+      <w:tr>
+        <w:tc>
+          <w:tcPr>
+            <w:tcW w:type="dxa" w:w="5040"/>
+            <w:tcBorders>
+              <w:top w:val="none" w:sz="0" w:space="0" w:color="auto"/>
+              <w:left w:val="none" w:sz="0" w:space="0" w:color="auto"/>
+              <w:bottom w:val="none" w:sz="0" w:space="0" w:color="auto"/>
+              <w:right w:val="none" w:sz="0" w:space="0" w:color="auto"/>
+              <w:insideH w:val="none" w:sz="0" w:space="0" w:color="auto"/>
+              <w:insideV w:val="none" w:sz="0" w:space="0" w:color="auto"/>
+            </w:tcBorders>
+            <w:tcMar>
+              <w:left w:w="0" w:type="dxa"/>
+            </w:tcMar>
+          </w:tcPr>
+          <w:p>
+            <w:pPr>
+              <w:spacing w:after="200" w:line="300" w:lineRule="auto"/>
+              <w:jc w:val="left"/>
+            </w:pPr>
+            <w:r>
+              <w:rPr>
+                <w:rFonts w:ascii="Quattrocento Sans" w:hAnsi="Quattrocento Sans" w:cs="Quattrocento Sans" w:eastAsia="Quattrocento Sans"/>
+                <w:b w:val="0"/>
+                <w:sz w:val="20"/>
+              </w:rPr>
+              <w:t xml:space="preserve">Assignment No: </w:t>
+            </w:r>
+            <w:r>
+              <w:rPr>
+                <w:rFonts w:ascii="Quattrocento Sans" w:hAnsi="Quattrocento Sans" w:cs="Quattrocento Sans" w:eastAsia="Quattrocento Sans"/>
+                <w:b/>
+                <w:sz w:val="20"/>
+              </w:rPr>
+              <w:t>Experiment 1</w:t>
+            </w:r>
+          </w:p>
+        </w:tc>
+        <w:tc>
+          <w:tcPr>
+            <w:tcW w:type="dxa" w:w="3989"/>
+            <w:tcBorders>
+              <w:top w:val="none" w:sz="0" w:space="0" w:color="auto"/>
+              <w:left w:val="none" w:sz="0" w:space="0" w:color="auto"/>
+              <w:bottom w:val="none" w:sz="0" w:space="0" w:color="auto"/>
+              <w:right w:val="none" w:sz="0" w:space="0" w:color="auto"/>
+              <w:insideH w:val="none" w:sz="0" w:space="0" w:color="auto"/>
+              <w:insideV w:val="none" w:sz="0" w:space="0" w:color="auto"/>
+            </w:tcBorders>
+          </w:tcPr>
+          <w:p>
+            <w:pPr>
+              <w:spacing w:after="200" w:line="300" w:lineRule="auto"/>
+              <w:jc w:val="left"/>
+            </w:pPr>
+            <w:r>
+              <w:rPr>
+                <w:rFonts w:ascii="Quattrocento Sans" w:hAnsi="Quattrocento Sans" w:cs="Quattrocento Sans" w:eastAsia="Quattrocento Sans"/>
+                <w:b w:val="0"/>
+                <w:sz w:val="20"/>
+              </w:rPr>
+            </w:r>
+          </w:p>
+        </w:tc>
+      </w:tr>
+      <w:tr>
+        <w:tc>
+          <w:tcPr>
+            <w:tcW w:type="dxa" w:w="5040"/>
+            <w:tcBorders>
+              <w:top w:val="none" w:sz="0" w:space="0" w:color="auto"/>
+              <w:left w:val="none" w:sz="0" w:space="0" w:color="auto"/>
+              <w:bottom w:val="none" w:sz="0" w:space="0" w:color="auto"/>
+              <w:right w:val="none" w:sz="0" w:space="0" w:color="auto"/>
+              <w:insideH w:val="none" w:sz="0" w:space="0" w:color="auto"/>
+              <w:insideV w:val="none" w:sz="0" w:space="0" w:color="auto"/>
+            </w:tcBorders>
+            <w:tcMar>
+              <w:left w:w="0" w:type="dxa"/>
+            </w:tcMar>
+          </w:tcPr>
+          <w:p>
+            <w:pPr>
+              <w:spacing w:after="200" w:line="300" w:lineRule="auto"/>
+              <w:jc w:val="left"/>
+            </w:pPr>
+            <w:r>
+              <w:rPr>
+                <w:rFonts w:ascii="Quattrocento Sans" w:hAnsi="Quattrocento Sans" w:cs="Quattrocento Sans" w:eastAsia="Quattrocento Sans"/>
+                <w:b w:val="0"/>
+                <w:sz w:val="20"/>
+              </w:rPr>
+              <w:t xml:space="preserve">Branch: </w:t>
+            </w:r>
+            <w:r>
+              <w:rPr>
+                <w:rFonts w:ascii="Quattrocento Sans" w:hAnsi="Quattrocento Sans" w:cs="Quattrocento Sans" w:eastAsia="Quattrocento Sans"/>
+                <w:b/>
+                <w:sz w:val="20"/>
+              </w:rPr>
+              <w:t>CMPN</w:t>
+            </w:r>
+          </w:p>
+        </w:tc>
+        <w:tc>
+          <w:tcPr>
+            <w:tcW w:type="dxa" w:w="3989"/>
+            <w:tcBorders>
+              <w:top w:val="none" w:sz="0" w:space="0" w:color="auto"/>
+              <w:left w:val="none" w:sz="0" w:space="0" w:color="auto"/>
+              <w:bottom w:val="none" w:sz="0" w:space="0" w:color="auto"/>
+              <w:right w:val="none" w:sz="0" w:space="0" w:color="auto"/>
+              <w:insideH w:val="none" w:sz="0" w:space="0" w:color="auto"/>
+              <w:insideV w:val="none" w:sz="0" w:space="0" w:color="auto"/>
+            </w:tcBorders>
+          </w:tcPr>
+          <w:p>
+            <w:pPr>
+              <w:spacing w:after="200" w:line="300" w:lineRule="auto"/>
+              <w:jc w:val="left"/>
+            </w:pPr>
+            <w:r>
+              <w:rPr>
+                <w:rFonts w:ascii="Quattrocento Sans" w:hAnsi="Quattrocento Sans" w:cs="Quattrocento Sans" w:eastAsia="Quattrocento Sans"/>
+                <w:b w:val="0"/>
+                <w:sz w:val="20"/>
+              </w:rPr>
+              <w:t xml:space="preserve">Vertical: </w:t>
+            </w:r>
+            <w:r>
+              <w:rPr>
+                <w:rFonts w:ascii="Quattrocento Sans" w:hAnsi="Quattrocento Sans" w:cs="Quattrocento Sans" w:eastAsia="Quattrocento Sans"/>
+                <w:b/>
+                <w:sz w:val="20"/>
+              </w:rPr>
+              <w:t>PC_PEC</w:t>
+            </w:r>
+          </w:p>
+        </w:tc>
+      </w:tr>
+      <w:tr>
+        <w:tc>
+          <w:tcPr>
+            <w:tcW w:type="dxa" w:w="5040"/>
+            <w:tcBorders>
+              <w:top w:val="none" w:sz="0" w:space="0" w:color="auto"/>
+              <w:left w:val="none" w:sz="0" w:space="0" w:color="auto"/>
+              <w:bottom w:val="none" w:sz="0" w:space="0" w:color="auto"/>
+              <w:right w:val="none" w:sz="0" w:space="0" w:color="auto"/>
+              <w:insideH w:val="none" w:sz="0" w:space="0" w:color="auto"/>
+              <w:insideV w:val="none" w:sz="0" w:space="0" w:color="auto"/>
+            </w:tcBorders>
+            <w:tcMar>
+              <w:left w:w="0" w:type="dxa"/>
+            </w:tcMar>
+          </w:tcPr>
+          <w:p>
+            <w:pPr>
+              <w:spacing w:after="200" w:line="300" w:lineRule="auto"/>
+              <w:jc w:val="left"/>
+            </w:pPr>
+            <w:r>
+              <w:rPr>
+                <w:rFonts w:ascii="Quattrocento Sans" w:hAnsi="Quattrocento Sans" w:cs="Quattrocento Sans" w:eastAsia="Quattrocento Sans"/>
+                <w:b w:val="0"/>
+                <w:sz w:val="20"/>
+              </w:rPr>
+              <w:t xml:space="preserve">Semester: </w:t>
+            </w:r>
+            <w:r>
+              <w:rPr>
+                <w:rFonts w:ascii="Quattrocento Sans" w:hAnsi="Quattrocento Sans" w:cs="Quattrocento Sans" w:eastAsia="Quattrocento Sans"/>
+                <w:b/>
+                <w:sz w:val="20"/>
+              </w:rPr>
+              <w:t>V</w:t>
+            </w:r>
+          </w:p>
+        </w:tc>
+        <w:tc>
+          <w:tcPr>
+            <w:tcW w:type="dxa" w:w="3989"/>
+            <w:tcBorders>
+              <w:top w:val="none" w:sz="0" w:space="0" w:color="auto"/>
+              <w:left w:val="none" w:sz="0" w:space="0" w:color="auto"/>
+              <w:bottom w:val="none" w:sz="0" w:space="0" w:color="auto"/>
+              <w:right w:val="none" w:sz="0" w:space="0" w:color="auto"/>
+              <w:insideH w:val="none" w:sz="0" w:space="0" w:color="auto"/>
+              <w:insideV w:val="none" w:sz="0" w:space="0" w:color="auto"/>
+            </w:tcBorders>
+          </w:tcPr>
+          <w:p>
+            <w:pPr>
+              <w:spacing w:after="200" w:line="300" w:lineRule="auto"/>
+              <w:jc w:val="left"/>
+            </w:pPr>
+            <w:r>
+              <w:rPr>
+                <w:rFonts w:ascii="Quattrocento Sans" w:hAnsi="Quattrocento Sans" w:cs="Quattrocento Sans" w:eastAsia="Quattrocento Sans"/>
+                <w:b w:val="0"/>
+                <w:sz w:val="20"/>
+              </w:rPr>
+              <w:t xml:space="preserve">Division: </w:t>
+            </w:r>
+            <w:r>
+              <w:rPr>
+                <w:rFonts w:ascii="Quattrocento Sans" w:hAnsi="Quattrocento Sans" w:cs="Quattrocento Sans" w:eastAsia="Quattrocento Sans"/>
+                <w:b/>
+                <w:sz w:val="20"/>
+              </w:rPr>
+              <w:t>A</w:t>
+            </w:r>
+          </w:p>
+        </w:tc>
+      </w:tr>
+      <w:tr>
+        <w:tc>
+          <w:tcPr>
+            <w:tcW w:type="dxa" w:w="5040"/>
+            <w:tcBorders>
+              <w:top w:val="none" w:sz="0" w:space="0" w:color="auto"/>
+              <w:left w:val="none" w:sz="0" w:space="0" w:color="auto"/>
+              <w:bottom w:val="none" w:sz="0" w:space="0" w:color="auto"/>
+              <w:right w:val="none" w:sz="0" w:space="0" w:color="auto"/>
+              <w:insideH w:val="none" w:sz="0" w:space="0" w:color="auto"/>
+              <w:insideV w:val="none" w:sz="0" w:space="0" w:color="auto"/>
+            </w:tcBorders>
+            <w:tcMar>
+              <w:left w:w="0" w:type="dxa"/>
+            </w:tcMar>
+          </w:tcPr>
+          <w:p>
+            <w:pPr>
+              <w:spacing w:after="200" w:line="300" w:lineRule="auto"/>
+              <w:jc w:val="left"/>
+            </w:pPr>
+            <w:r>
+              <w:rPr>
+                <w:rFonts w:ascii="Quattrocento Sans" w:hAnsi="Quattrocento Sans" w:cs="Quattrocento Sans" w:eastAsia="Quattrocento Sans"/>
+                <w:b w:val="0"/>
+                <w:sz w:val="20"/>
+              </w:rPr>
+              <w:t xml:space="preserve">Subject Name: </w:t>
+            </w:r>
+            <w:r>
+              <w:rPr>
+                <w:rFonts w:ascii="Quattrocento Sans" w:hAnsi="Quattrocento Sans" w:cs="Quattrocento Sans" w:eastAsia="Quattrocento Sans"/>
+                <w:b/>
+                <w:sz w:val="20"/>
+              </w:rPr>
+              <w:t>Machine Learning</w:t>
+            </w:r>
+          </w:p>
+        </w:tc>
+        <w:tc>
+          <w:tcPr>
+            <w:tcW w:type="dxa" w:w="3989"/>
+            <w:tcBorders>
+              <w:top w:val="none" w:sz="0" w:space="0" w:color="auto"/>
+              <w:left w:val="none" w:sz="0" w:space="0" w:color="auto"/>
+              <w:bottom w:val="none" w:sz="0" w:space="0" w:color="auto"/>
+              <w:right w:val="none" w:sz="0" w:space="0" w:color="auto"/>
+              <w:insideH w:val="none" w:sz="0" w:space="0" w:color="auto"/>
+              <w:insideV w:val="none" w:sz="0" w:space="0" w:color="auto"/>
+            </w:tcBorders>
+          </w:tcPr>
+          <w:p>
+            <w:pPr>
+              <w:spacing w:after="200" w:line="300" w:lineRule="auto"/>
+              <w:jc w:val="left"/>
+            </w:pPr>
+            <w:r>
+              <w:rPr>
+                <w:rFonts w:ascii="Quattrocento Sans" w:hAnsi="Quattrocento Sans" w:cs="Quattrocento Sans" w:eastAsia="Quattrocento Sans"/>
+                <w:b w:val="0"/>
+                <w:sz w:val="20"/>
+              </w:rPr>
+              <w:t xml:space="preserve">Subject Code: </w:t>
+            </w:r>
+            <w:r>
+              <w:rPr>
+                <w:rFonts w:ascii="Quattrocento Sans" w:hAnsi="Quattrocento Sans" w:cs="Quattrocento Sans" w:eastAsia="Quattrocento Sans"/>
+                <w:b/>
+                <w:sz w:val="20"/>
+              </w:rPr>
+              <w:t>PCCC05T</w:t>
+            </w:r>
+          </w:p>
+        </w:tc>
+      </w:tr>
+    </w:tbl>
+    <w:p>
+      <w:pPr>
+        <w:spacing w:after="200" w:line="300" w:lineRule="auto" w:before="280"/>
       </w:pPr>
       <w:r>
         <w:rPr>
-          <w:b/>
-          <w:sz w:val="28"/>
+          <w:rFonts w:ascii="Quattrocento Sans" w:hAnsi="Quattrocento Sans" w:cs="Quattrocento Sans" w:eastAsia="Quattrocento Sans"/>
+          <w:b w:val="0"/>
+          <w:sz w:val="20"/>
         </w:rPr>
-        <w:t>Vidyalankar Institute of Technology, Mumbai</w:t>
+        <w:t>I hereby declare that for the assignment / academic activity submitted by me, I confirm ONE of the following statements by ticking (☐) the appropriate box:</w:t>
       </w:r>
     </w:p>
-    <w:p/>
     <w:p>
+      <w:pPr>
+        <w:spacing w:after="200" w:line="300" w:lineRule="auto" w:before="200"/>
+      </w:pPr>
       <w:r>
-        <w:t xml:space="preserve">Assignment No: </w:t>
+        <w:rPr>
+          <w:rFonts w:ascii="Quattrocento Sans" w:hAnsi="Quattrocento Sans" w:cs="Quattrocento Sans" w:eastAsia="Quattrocento Sans"/>
+          <w:b w:val="0"/>
+          <w:sz w:val="20"/>
+        </w:rPr>
+        <w:t>✓ (1) I have prepared the assignment / academic activity entirely by myself.</w:t>
       </w:r>
       <w:r>
         <w:rPr>
-          <w:b/>
+          <w:rFonts w:ascii="Quattrocento Sans" w:hAnsi="Quattrocento Sans" w:cs="Quattrocento Sans" w:eastAsia="Quattrocento Sans"/>
+          <w:b w:val="0"/>
+          <w:sz w:val="20"/>
         </w:rPr>
-        <w:t>Experiment 1</w:t>
-      </w:r>
-    </w:p>
-    <w:p>
-      <w:r>
-        <w:t xml:space="preserve">Branch: </w:t>
+        <w:br/>
       </w:r>
       <w:r>
         <w:rPr>
-          <w:b/>
+          <w:rFonts w:ascii="Quattrocento Sans" w:hAnsi="Quattrocento Sans" w:cs="Quattrocento Sans" w:eastAsia="Quattrocento Sans"/>
+          <w:b w:val="0"/>
+          <w:sz w:val="20"/>
         </w:rPr>
-        <w:t>CMPN</w:t>
-      </w:r>
-      <w:r>
-        <w:t xml:space="preserve">    </w:t>
-      </w:r>
-      <w:r>
-        <w:t xml:space="preserve">Vertical: </w:t>
+        <w:t>✓ (2) I have completed the assignment / academic activity with academic guidance or discussion from seniors / friends / peers, while ensuring the work is my own.</w:t>
       </w:r>
       <w:r>
         <w:rPr>
-          <w:b/>
+          <w:rFonts w:ascii="Quattrocento Sans" w:hAnsi="Quattrocento Sans" w:cs="Quattrocento Sans" w:eastAsia="Quattrocento Sans"/>
+          <w:b w:val="0"/>
+          <w:sz w:val="20"/>
         </w:rPr>
-        <w:t>PC_PEC</w:t>
-      </w:r>
-    </w:p>
-    <w:p>
-      <w:r>
-        <w:t xml:space="preserve">Semester: </w:t>
+        <w:br/>
       </w:r>
       <w:r>
         <w:rPr>
-          <w:b/>
+          <w:rFonts w:ascii="Quattrocento Sans" w:hAnsi="Quattrocento Sans" w:cs="Quattrocento Sans" w:eastAsia="Quattrocento Sans"/>
+          <w:b w:val="0"/>
+          <w:sz w:val="20"/>
         </w:rPr>
-        <w:t>V</w:t>
-      </w:r>
-      <w:r>
-        <w:t xml:space="preserve">    Division: </w:t>
+        <w:t>✓ (3) I have used AI-based tools only as an aid and have appropriately acknowledged or cited their use as per the ethical guidelines of the Institute.</w:t>
       </w:r>
       <w:r>
         <w:rPr>
-          <w:b/>
+          <w:rFonts w:ascii="Quattrocento Sans" w:hAnsi="Quattrocento Sans" w:cs="Quattrocento Sans" w:eastAsia="Quattrocento Sans"/>
+          <w:b w:val="0"/>
+          <w:sz w:val="20"/>
         </w:rPr>
-        <w:t>A</w:t>
-      </w:r>
-      <w:r>
         <w:br/>
-        <w:t xml:space="preserve">Subject Name: </w:t>
       </w:r>
       <w:r>
         <w:rPr>
-          <w:b/>
+          <w:rFonts w:ascii="Quattrocento Sans" w:hAnsi="Quattrocento Sans" w:cs="Quattrocento Sans" w:eastAsia="Quattrocento Sans"/>
+          <w:b w:val="0"/>
+          <w:sz w:val="20"/>
         </w:rPr>
-        <w:t>Machine Learning</w:t>
-      </w:r>
-      <w:r>
-        <w:t xml:space="preserve">    Subject Code: </w:t>
+        <w:t>☐ (4) I have used AI-based tools and directly copy-pasted content for the assignment / academic activity.</w:t>
       </w:r>
       <w:r>
         <w:rPr>
-          <w:b/>
+          <w:rFonts w:ascii="Quattrocento Sans" w:hAnsi="Quattrocento Sans" w:cs="Quattrocento Sans" w:eastAsia="Quattrocento Sans"/>
+          <w:b w:val="0"/>
+          <w:sz w:val="20"/>
         </w:rPr>
-        <w:t>PCCC05T</w:t>
+        <w:br/>
       </w:r>
-    </w:p>
-    <w:p>
       <w:r>
-        <w:t>I hereby declare that for the assignment / academic activity submitted by me, I confirm the following statement(s) by ticking (☑) the appropriate box(es):</w:t>
-      </w:r>
-    </w:p>
-    <w:p>
-      <w:r>
-        <w:t>☑ (1) I have prepared the assignment / academic activity entirely by myself.</w:t>
-      </w:r>
-    </w:p>
-    <w:p>
-      <w:r>
-        <w:t>☑ (2) I have completed the assignment / academic activity with academic guidance or discussion from seniors / friends / peers, while ensuring the work is my own.</w:t>
-      </w:r>
-    </w:p>
-    <w:p>
-      <w:r>
-        <w:t>☑ (3) I have used AI-based tools only as an aid and have appropriately acknowledged or cited their use as per the ethical guidelines of the Institute.</w:t>
-      </w:r>
-    </w:p>
-    <w:p>
-      <w:r>
-        <w:t>☐ (4) I have used AI-based tools and directly copy-pasted content for the assignment / academic activity.</w:t>
-      </w:r>
-    </w:p>
-    <w:p>
-      <w:r>
+        <w:rPr>
+          <w:rFonts w:ascii="Quattrocento Sans" w:hAnsi="Quattrocento Sans" w:cs="Quattrocento Sans" w:eastAsia="Quattrocento Sans"/>
+          <w:b w:val="0"/>
+          <w:sz w:val="20"/>
+        </w:rPr>
         <w:t>☐ (5) I have copied the assignment / academic activity from peers / friends.</w:t>
       </w:r>
     </w:p>
     <w:p>
       <w:pPr>
+        <w:spacing w:after="200" w:line="300" w:lineRule="auto" w:before="280"/>
         <w:jc w:val="both"/>
       </w:pPr>
       <w:r>
+        <w:rPr>
+          <w:rFonts w:ascii="Quattrocento Sans" w:hAnsi="Quattrocento Sans" w:cs="Quattrocento Sans" w:eastAsia="Quattrocento Sans"/>
+          <w:b w:val="0"/>
+          <w:sz w:val="20"/>
+        </w:rPr>
         <w:t>I understand that selecting options (4) or (5) indicates unethical academic practice and may attract academic penalties, including rejection of the assignment or disciplinary action, as per the rules of Vidyalankar Institute of Technology, Mumbai. I submit this declaration truthfully and accept full responsibility for the same.</w:t>
       </w:r>
     </w:p>
     <w:p>
-      <w:r>
-        <w:t xml:space="preserve">Student Name: </w:t>
-      </w:r>
-      <w:r>
-        <w:rPr>
-          <w:b/>
-        </w:rPr>
-        <w:t>Test Student</w:t>
-      </w:r>
-      <w:r>
-        <w:t xml:space="preserve">  Roll No.: </w:t>
-      </w:r>
-      <w:r>
-        <w:rPr>
-          <w:b/>
-        </w:rPr>
-        <w:t>24102A0000</w:t>
-      </w:r>
+      <w:pPr>
+        <w:spacing w:after="200" w:line="300" w:lineRule="auto"/>
+      </w:pPr>
     </w:p>
-    <w:p>
-      <w:r>
-        <w:t xml:space="preserve">Signature: </w:t>
-      </w:r>
-      <w:r>
-        <w:t xml:space="preserve">          </w:t>
-      </w:r>
-      <w:r>
-        <w:t xml:space="preserve">  Date: </w:t>
-      </w:r>
-      <w:r>
-        <w:rPr>
-          <w:b/>
-        </w:rPr>
-        <w:t>20-07-2026</w:t>
-      </w:r>
-    </w:p>
+    <w:tbl>
+      <w:tblPr>
+        <w:tblW w:type="auto" w:w="0"/>
+        <w:tblLook w:firstColumn="1" w:firstRow="1" w:lastColumn="0" w:lastRow="0" w:noHBand="0" w:noVBand="1" w:val="04A0"/>
+        <w:tblBorders>
+          <w:top w:val="none" w:sz="0" w:space="0" w:color="auto"/>
+          <w:left w:val="none" w:sz="0" w:space="0" w:color="auto"/>
+          <w:bottom w:val="none" w:sz="0" w:space="0" w:color="auto"/>
+          <w:right w:val="none" w:sz="0" w:space="0" w:color="auto"/>
+          <w:insideH w:val="none" w:sz="0" w:space="0" w:color="auto"/>
+          <w:insideV w:val="none" w:sz="0" w:space="0" w:color="auto"/>
+        </w:tblBorders>
+        <w:tblCellMar>
+          <w:top w:w="0" w:type="dxa"/>
+          <w:left w:w="0" w:type="dxa"/>
+          <w:bottom w:w="0" w:type="dxa"/>
+          <w:right w:w="0" w:type="dxa"/>
+        </w:tblCellMar>
+        <w:tblInd w:w="0" w:type="dxa"/>
+      </w:tblPr>
+      <w:tblGrid>
+        <w:gridCol w:w="4513"/>
+        <w:gridCol w:w="4513"/>
+      </w:tblGrid>
+      <w:tr>
+        <w:tc>
+          <w:tcPr>
+            <w:tcW w:type="dxa" w:w="5040"/>
+            <w:tcBorders>
+              <w:top w:val="none" w:sz="0" w:space="0" w:color="auto"/>
+              <w:left w:val="none" w:sz="0" w:space="0" w:color="auto"/>
+              <w:bottom w:val="none" w:sz="0" w:space="0" w:color="auto"/>
+              <w:right w:val="none" w:sz="0" w:space="0" w:color="auto"/>
+              <w:insideH w:val="none" w:sz="0" w:space="0" w:color="auto"/>
+              <w:insideV w:val="none" w:sz="0" w:space="0" w:color="auto"/>
+            </w:tcBorders>
+            <w:tcMar>
+              <w:left w:w="0" w:type="dxa"/>
+            </w:tcMar>
+          </w:tcPr>
+          <w:p>
+            <w:pPr>
+              <w:spacing w:after="200" w:line="300" w:lineRule="auto"/>
+              <w:jc w:val="left"/>
+            </w:pPr>
+            <w:r>
+              <w:rPr>
+                <w:rFonts w:ascii="Quattrocento Sans" w:hAnsi="Quattrocento Sans" w:cs="Quattrocento Sans" w:eastAsia="Quattrocento Sans"/>
+                <w:b w:val="0"/>
+                <w:sz w:val="20"/>
+              </w:rPr>
+              <w:t xml:space="preserve">Student Name: </w:t>
+            </w:r>
+            <w:r>
+              <w:rPr>
+                <w:rFonts w:ascii="Quattrocento Sans" w:hAnsi="Quattrocento Sans" w:cs="Quattrocento Sans" w:eastAsia="Quattrocento Sans"/>
+                <w:b/>
+                <w:sz w:val="20"/>
+              </w:rPr>
+              <w:t>Test Student</w:t>
+            </w:r>
+          </w:p>
+        </w:tc>
+        <w:tc>
+          <w:tcPr>
+            <w:tcW w:type="dxa" w:w="3989"/>
+            <w:tcBorders>
+              <w:top w:val="none" w:sz="0" w:space="0" w:color="auto"/>
+              <w:left w:val="none" w:sz="0" w:space="0" w:color="auto"/>
+              <w:bottom w:val="none" w:sz="0" w:space="0" w:color="auto"/>
+              <w:right w:val="none" w:sz="0" w:space="0" w:color="auto"/>
+              <w:insideH w:val="none" w:sz="0" w:space="0" w:color="auto"/>
+              <w:insideV w:val="none" w:sz="0" w:space="0" w:color="auto"/>
+            </w:tcBorders>
+          </w:tcPr>
+          <w:p>
+            <w:pPr>
+              <w:spacing w:after="200" w:line="300" w:lineRule="auto"/>
+              <w:jc w:val="left"/>
+            </w:pPr>
+            <w:r>
+              <w:rPr>
+                <w:rFonts w:ascii="Quattrocento Sans" w:hAnsi="Quattrocento Sans" w:cs="Quattrocento Sans" w:eastAsia="Quattrocento Sans"/>
+                <w:b w:val="0"/>
+                <w:sz w:val="20"/>
+              </w:rPr>
+              <w:t xml:space="preserve">Roll No.: </w:t>
+            </w:r>
+            <w:r>
+              <w:rPr>
+                <w:rFonts w:ascii="Quattrocento Sans" w:hAnsi="Quattrocento Sans" w:cs="Quattrocento Sans" w:eastAsia="Quattrocento Sans"/>
+                <w:b/>
+                <w:sz w:val="20"/>
+              </w:rPr>
+              <w:t>24102A0000</w:t>
+            </w:r>
+          </w:p>
+        </w:tc>
+      </w:tr>
+      <w:tr>
+        <w:tc>
+          <w:tcPr>
+            <w:tcW w:type="dxa" w:w="5040"/>
+            <w:tcBorders>
+              <w:top w:val="none" w:sz="0" w:space="0" w:color="auto"/>
+              <w:left w:val="none" w:sz="0" w:space="0" w:color="auto"/>
+              <w:bottom w:val="none" w:sz="0" w:space="0" w:color="auto"/>
+              <w:right w:val="none" w:sz="0" w:space="0" w:color="auto"/>
+              <w:insideH w:val="none" w:sz="0" w:space="0" w:color="auto"/>
+              <w:insideV w:val="none" w:sz="0" w:space="0" w:color="auto"/>
+            </w:tcBorders>
+            <w:tcMar>
+              <w:left w:w="0" w:type="dxa"/>
+            </w:tcMar>
+          </w:tcPr>
+          <w:p>
+            <w:pPr>
+              <w:spacing w:after="200" w:line="300" w:lineRule="auto"/>
+              <w:jc w:val="left"/>
+            </w:pPr>
+            <w:r>
+              <w:rPr>
+                <w:rFonts w:ascii="Quattrocento Sans" w:hAnsi="Quattrocento Sans" w:cs="Quattrocento Sans" w:eastAsia="Quattrocento Sans"/>
+                <w:b w:val="0"/>
+                <w:sz w:val="20"/>
+              </w:rPr>
+              <w:t xml:space="preserve">Signature: </w:t>
+            </w:r>
+          </w:p>
+        </w:tc>
+        <w:tc>
+          <w:tcPr>
+            <w:tcW w:type="dxa" w:w="3989"/>
+            <w:tcBorders>
+              <w:top w:val="none" w:sz="0" w:space="0" w:color="auto"/>
+              <w:left w:val="none" w:sz="0" w:space="0" w:color="auto"/>
+              <w:bottom w:val="none" w:sz="0" w:space="0" w:color="auto"/>
+              <w:right w:val="none" w:sz="0" w:space="0" w:color="auto"/>
+              <w:insideH w:val="none" w:sz="0" w:space="0" w:color="auto"/>
+              <w:insideV w:val="none" w:sz="0" w:space="0" w:color="auto"/>
+            </w:tcBorders>
+          </w:tcPr>
+          <w:p>
+            <w:pPr>
+              <w:spacing w:after="200" w:line="300" w:lineRule="auto"/>
+              <w:jc w:val="left"/>
+            </w:pPr>
+            <w:r>
+              <w:rPr>
+                <w:rFonts w:ascii="Quattrocento Sans" w:hAnsi="Quattrocento Sans" w:cs="Quattrocento Sans" w:eastAsia="Quattrocento Sans"/>
+                <w:b w:val="0"/>
+                <w:sz w:val="20"/>
+              </w:rPr>
+              <w:t xml:space="preserve">Date: </w:t>
+            </w:r>
+            <w:r>
+              <w:rPr>
+                <w:rFonts w:ascii="Quattrocento Sans" w:hAnsi="Quattrocento Sans" w:cs="Quattrocento Sans" w:eastAsia="Quattrocento Sans"/>
+                <w:b/>
+                <w:sz w:val="20"/>
+              </w:rPr>
+              <w:t>20-07-2026</w:t>
+            </w:r>
+          </w:p>
+        </w:tc>
+      </w:tr>
+    </w:tbl>
     <w:sectPr>
-      <w:pgSz w:w="12240" w:h="15840"/>
-      <w:pgMar w:top="1440" w:right="1800" w:bottom="1440" w:left="1800" w:header="720" w:footer="720" w:gutter="0"/>
+      <w:pgSz w:w="11906" w:h="16838"/>
+      <w:pgMar w:top="1440" w:right="1440" w:bottom="1440" w:left="1440" w:header="720" w:footer="720" w:gutter="0"/>
       <w:cols w:space="720"/>
       <w:docGrid w:linePitch="360"/>
     </w:sectPr>
@@ -548,6 +994,13 @@
     <w:name w:val="Normal"/>
     <w:qFormat/>
     <w:rsid w:val="00FC693F"/>
+    <w:pPr>
+      <w:spacing w:after="200" w:line="300" w:lineRule="auto"/>
+    </w:pPr>
+    <w:rPr>
+      <w:rFonts w:ascii="Quattrocento Sans" w:hAnsi="Quattrocento Sans" w:cs="Quattrocento Sans" w:eastAsia="Quattrocento Sans"/>
+      <w:sz w:val="20"/>
+    </w:rPr>
   </w:style>
   <w:style w:type="paragraph" w:styleId="Header">
     <w:name w:val="header"/>

</xml_diff>